<commit_message>
Add AI upload pipeline and Prediko-Shopify work to Climb On Equipment
Reflect current work at Climb On Equipment on both the Experience page
and the resume: building an AI-powered product upload pipeline that
replaces manual, error-prone catalog entry, and new data flow
automations between the newly integrated Prediko and Shopify inventory
systems.

- experience.ts: add both as the lead bullets for the role, and add
  Prediko / AI-Powered Automation to its tools list.
- Resume: lead the professional summary and the top Career Highlight
  with the AI pipeline work, add the same two bullets to the Climb On
  Equipment entry, add Prediko to the Tools & Systems table, and
  mention the pipeline/integration in the E-commerce & Platform
  Operations knowledge area.

Co-Authored-By: Claude Sonnet 5 <noreply@anthropic.com>
</commit_message>
<xml_diff>
--- a/public/resume/Mitchell-Palmer-Resume.docx
+++ b/public/resume/Mitchell-Palmer-Resume.docx
@@ -183,7 +183,7 @@
         <w:rPr>
           <w:rtl w:val="0"/>
         </w:rPr>
-        <w:t xml:space="preserve">6+ years of operations experience and 4+ years in data analytics, including automation pipelines, statistical analysis, and applied modeling in fast-moving, resource-constrained businesses. Currently manage a 4,000+ SKU e-commerce catalog at Climb On Equipment; previously drove 100% e-commerce growth in two years at RMU Outdoors while maintaining oversight of $1.8M in inventory across global distribution channels, and built operational pipelines for inventory management and reporting automation.</w:t>
+        <w:t xml:space="preserve">6+ years of operations experience and 4+ years in data analytics, including automation pipelines, statistical analysis, and applied modeling in fast-moving, resource-constrained businesses. Currently manage a 4,000+ SKU e-commerce catalog at Climb On Equipment, building an AI-powered product upload pipeline and new inventory-system data flow automations (Prediko ⇌ Shopify); previously drove 100% e-commerce growth in two years at RMU Outdoors while maintaining oversight of $1.8M in inventory across global distribution channels, and built operational pipelines for inventory management and reporting automation.</w:t>
       </w:r>
     </w:p>
     <w:p>
@@ -288,7 +288,7 @@
         <w:rPr>
           <w:rtl w:val="0"/>
         </w:rPr>
-        <w:t xml:space="preserve"> | Shopify store ownership, large-scale product catalog management (variant architecture, metafields/metaobjects, bulk operations via Matrixify), third-party app integration and troubleshooting, D2C and B2B order workflows, dynamic pricing systems</w:t>
+        <w:t xml:space="preserve"> | Shopify store ownership, large-scale product catalog management (variant architecture, metafields/metaobjects, bulk operations via Matrixify), AI-powered product upload pipelines, inventory-system integrations (Prediko ⇌ Shopify), D2C and B2B order workflows, dynamic pricing systems</w:t>
       </w:r>
     </w:p>
     <w:p>
@@ -352,7 +352,7 @@
         <w:rPr>
           <w:rtl w:val="0"/>
         </w:rPr>
-        <w:t xml:space="preserve">Maintain catalog integrity across </w:t>
+        <w:t xml:space="preserve">Built an </w:t>
       </w:r>
       <w:r>
         <w:rPr>
@@ -360,13 +360,13 @@
           <w:bCs w:val="1"/>
           <w:rtl w:val="0"/>
         </w:rPr>
-        <w:t xml:space="preserve">4,000+ SKUs</w:t>
-      </w:r>
-      <w:r>
-        <w:rPr>
-          <w:rtl w:val="0"/>
-        </w:rPr>
-        <w:t xml:space="preserve"> and </w:t>
+        <w:t xml:space="preserve">AI-powered product upload pipeline</w:t>
+      </w:r>
+      <w:r>
+        <w:rPr>
+          <w:rtl w:val="0"/>
+        </w:rPr>
+        <w:t xml:space="preserve"> at </w:t>
       </w:r>
       <w:r>
         <w:rPr>
@@ -374,13 +374,13 @@
           <w:bCs w:val="1"/>
           <w:rtl w:val="0"/>
         </w:rPr>
-        <w:t xml:space="preserve">10,000+ annual transactions</w:t>
-      </w:r>
-      <w:r>
-        <w:rPr>
-          <w:rtl w:val="0"/>
-        </w:rPr>
-        <w:t xml:space="preserve"> at </w:t>
+        <w:t xml:space="preserve">Climb On Equipment</w:t>
+      </w:r>
+      <w:r>
+        <w:rPr>
+          <w:rtl w:val="0"/>
+        </w:rPr>
+        <w:t xml:space="preserve">, replacing manual, error-prone catalog entry across </w:t>
       </w:r>
       <w:r>
         <w:rPr>
@@ -388,13 +388,27 @@
           <w:bCs w:val="1"/>
           <w:rtl w:val="0"/>
         </w:rPr>
-        <w:t xml:space="preserve">Climb On Equipment</w:t>
-      </w:r>
-      <w:r>
-        <w:rPr>
-          <w:rtl w:val="0"/>
-        </w:rPr>
-        <w:t xml:space="preserve">, managing complex variant architecture and bulk catalog operations via Matrixify.</w:t>
+        <w:t xml:space="preserve">4,000+ SKUs</w:t>
+      </w:r>
+      <w:r>
+        <w:rPr>
+          <w:rtl w:val="0"/>
+        </w:rPr>
+        <w:t xml:space="preserve"> and </w:t>
+      </w:r>
+      <w:r>
+        <w:rPr>
+          <w:b w:val="1"/>
+          <w:bCs w:val="1"/>
+          <w:rtl w:val="0"/>
+        </w:rPr>
+        <w:t xml:space="preserve">10,000+ annual transactions</w:t>
+      </w:r>
+      <w:r>
+        <w:rPr>
+          <w:rtl w:val="0"/>
+        </w:rPr>
+        <w:t xml:space="preserve"> with a streamlined, automated workflow.</w:t>
       </w:r>
     </w:p>
     <w:p>
@@ -579,7 +593,7 @@
               <w:rPr>
                 <w:rtl w:val="0"/>
               </w:rPr>
-              <w:t xml:space="preserve"> – QuickBooks Commerce, Shopify, Square</w:t>
+              <w:t xml:space="preserve"> – QuickBooks Commerce, Shopify, Square, Prediko</w:t>
             </w:r>
           </w:p>
         </w:tc>
@@ -995,6 +1009,38 @@
           <w:numId w:val="2"/>
         </w:numPr>
         <w:spacing w:after="0" w:afterAutospacing="0"/>
+        <w:ind w:left="720" w:hanging="360"/>
+      </w:pPr>
+      <w:r>
+        <w:rPr>
+          <w:rtl w:val="0"/>
+        </w:rPr>
+        <w:t xml:space="preserve">Building an AI-powered product upload pipeline, shifting manual, labour-intensive, error-prone catalog entry to a streamlined, automated workflow.</w:t>
+      </w:r>
+    </w:p>
+    <w:p>
+      <w:pPr>
+        <w:numPr>
+          <w:ilvl w:val="0"/>
+          <w:numId w:val="2"/>
+        </w:numPr>
+        <w:spacing w:after="0" w:afterAutospacing="0" w:before="0" w:beforeAutospacing="0"/>
+        <w:ind w:left="720" w:hanging="360"/>
+      </w:pPr>
+      <w:r>
+        <w:rPr>
+          <w:rtl w:val="0"/>
+        </w:rPr>
+        <w:t xml:space="preserve">Building new data flow automations between newly integrated inventory management systems (Prediko ⇌ Shopify) to drive operational efficiency and productivity.</w:t>
+      </w:r>
+    </w:p>
+    <w:p>
+      <w:pPr>
+        <w:numPr>
+          <w:ilvl w:val="0"/>
+          <w:numId w:val="2"/>
+        </w:numPr>
+        <w:spacing w:after="0" w:afterAutospacing="0" w:before="0" w:beforeAutospacing="0"/>
         <w:ind w:left="720" w:hanging="360"/>
       </w:pPr>
       <w:r>

</xml_diff>

<commit_message>
Correct Data Services Contractor timeline: Feb-May, limited hours
The engagement did run February-May 2026 as originally listed; it was
low-hours, not short-duration, so the previous correction to Feb-March
was wrong. Revert the date range and reframe the lead bullet around
"limited-hours" rather than "short-term," reflecting that the work was
building the SSOT foundations before the engagement wound down, not a
briefer contract.

Co-Authored-By: Claude Sonnet 5 <noreply@anthropic.com>
</commit_message>
<xml_diff>
--- a/public/resume/Mitchell-Palmer-Resume.docx
+++ b/public/resume/Mitchell-Palmer-Resume.docx
@@ -1338,7 +1338,7 @@
         <w:t xml:space="preserve"> </w:t>
         <w:tab/>
         <w:tab/>
-        <w:t>02/2026 - 03/2026</w:t>
+        <w:t>02/2026 - 05/2026</w:t>
       </w:r>
     </w:p>
     <w:p>
@@ -1354,7 +1354,7 @@
       </w:pPr>
       <w:r>
         <w:rPr/>
-        <w:t>Built the initial Single Source of Truth (SSOT) document framework for a short-term data infrastructure engagement.</w:t>
+        <w:t>Established the foundational Single Source of Truth (SSOT) document framework for a limited-hours data infrastructure engagement.</w:t>
       </w:r>
     </w:p>
     <w:p>

</xml_diff>

<commit_message>
Fix font rendering in generated PDF/docx, sync minor wording
Your saved .odt (with font embedding off, as recommended) renders
correctly on your own machine where the brand fonts are installed, but
the PDF/docx generated from it on this machine substituted generic
fonts for the title and headings, since those fonts aren't installed
here.

Fix: generate the published .docx/.pdf from a temporary copy with the
brand fonts (Lexend, Merriweather, Open Sans, Trebuchet MS) re-embedded,
so they render correctly regardless of what's installed on the
generating machine. The committed .odt itself stays as your lean,
font-free editing copy, matching your current LibreOffice setup.

Also sync a small wording tweak you made to the last Climb On Equipment
bullet onto the website's Experience page.

Co-Authored-By: Claude Sonnet 5 <noreply@anthropic.com>
</commit_message>
<xml_diff>
--- a/public/resume/Mitchell-Palmer-Resume.docx
+++ b/public/resume/Mitchell-Palmer-Resume.docx
@@ -1010,21 +1010,11 @@
         <w:pStyle w:val="Heading2"/>
         <w:rPr/>
       </w:pPr>
+      <w:r>
+        <w:rPr/>
+      </w:r>
       <w:bookmarkStart w:id="7" w:name="_ayi3o459hwy"/>
       <w:bookmarkEnd w:id="7"/>
-      <w:r>
-        <w:rPr/>
-        <w:t>Experience</w:t>
-      </w:r>
-    </w:p>
-    <w:p>
-      <w:pPr>
-        <w:pStyle w:val="normal1"/>
-        <w:rPr/>
-      </w:pPr>
-      <w:r>
-        <w:rPr/>
-      </w:r>
     </w:p>
     <w:tbl>
       <w:tblPr>
@@ -1230,7 +1220,23 @@
       </w:pPr>
       <w:r>
         <w:rPr/>
-        <w:t>Coordinate associates on catalog workflows and keep process documentation current as the platform and integrations evolve.</w:t>
+        <w:t xml:space="preserve">Coordinate associates on catalog workflows and </w:t>
+      </w:r>
+      <w:r>
+        <w:rPr/>
+        <w:t>maintain</w:t>
+      </w:r>
+      <w:r>
+        <w:rPr/>
+        <w:t xml:space="preserve"> </w:t>
+      </w:r>
+      <w:r>
+        <w:rPr/>
+        <w:t xml:space="preserve">current </w:t>
+      </w:r>
+      <w:r>
+        <w:rPr/>
+        <w:t>process documentation.</w:t>
       </w:r>
     </w:p>
     <w:p>
@@ -1337,7 +1343,6 @@
         <w:tab/>
         <w:t xml:space="preserve"> </w:t>
         <w:tab/>
-        <w:tab/>
         <w:t>02/2026 - 05/2026</w:t>
       </w:r>
     </w:p>
@@ -1388,7 +1393,6 @@
       <w:r>
         <w:rPr/>
         <w:t>| Full Time</w:t>
-        <w:tab/>
         <w:tab/>
         <w:tab/>
         <w:tab/>
@@ -1696,8 +1700,8 @@
           <w:ilvl w:val="0"/>
           <w:numId w:val="2"/>
         </w:numPr>
-        <w:spacing w:lineRule="auto" w:line="240" w:before="0" w:after="0"/>
-        <w:ind w:hanging="360" w:start="720" w:end="0"/>
+        <w:spacing w:before="120" w:after="0"/>
+        <w:ind w:hanging="360" w:start="720" w:end="300"/>
         <w:rPr>
           <w:u w:val="none"/>
         </w:rPr>
@@ -1721,8 +1725,8 @@
           <w:ilvl w:val="0"/>
           <w:numId w:val="2"/>
         </w:numPr>
-        <w:spacing w:lineRule="auto" w:line="240" w:before="0" w:after="0"/>
-        <w:ind w:hanging="360" w:start="720" w:end="0"/>
+        <w:spacing w:before="120" w:after="0"/>
+        <w:ind w:hanging="360" w:start="720" w:end="300"/>
         <w:rPr>
           <w:u w:val="none"/>
         </w:rPr>
@@ -1746,8 +1750,8 @@
           <w:ilvl w:val="0"/>
           <w:numId w:val="2"/>
         </w:numPr>
-        <w:spacing w:lineRule="auto" w:line="240" w:before="0" w:after="240"/>
-        <w:ind w:hanging="360" w:start="720" w:end="0"/>
+        <w:spacing w:before="120" w:after="0"/>
+        <w:ind w:hanging="360" w:start="720" w:end="300"/>
         <w:rPr>
           <w:u w:val="none"/>
         </w:rPr>
@@ -1787,7 +1791,6 @@
   <w:p>
     <w:pPr>
       <w:pStyle w:val="Footer"/>
-      <w:bidi w:val="0"/>
       <w:rPr/>
     </w:pPr>
     <w:r>

</xml_diff>

<commit_message>
Update resume to 6+ years of data-focused experience (was 4+)
Since you're 31 and started the RMU Outdoors role in 2020, that's now
6+ years, not 4+. Merge the summary's two experience claims ("6+ years
of operations" / "4+ years in data analysis") into one: "6+ years of
operations and data-focused experience."

Co-Authored-By: Claude Sonnet 5 <noreply@anthropic.com>
</commit_message>
<xml_diff>
--- a/public/resume/Mitchell-Palmer-Resume.docx
+++ b/public/resume/Mitchell-Palmer-Resume.docx
@@ -244,29 +244,11 @@
     <w:p>
       <w:pPr>
         <w:pStyle w:val="normal1"/>
-        <w:rPr>
-          <w:color w:val="000000"/>
-        </w:rPr>
-      </w:pPr>
-      <w:r>
-        <w:rPr/>
-        <w:t>6+ years of operations experience and 4+ years in data anal</w:t>
-      </w:r>
-      <w:r>
-        <w:rPr/>
-        <w:t>ysis</w:t>
-      </w:r>
-      <w:r>
-        <w:rPr/>
-        <w:t xml:space="preserve">, including automation pipelines, statistical analysis, and applied modeling in </w:t>
-      </w:r>
-      <w:r>
-        <w:rPr/>
-        <w:t xml:space="preserve">entrepreneurial and </w:t>
-      </w:r>
-      <w:r>
-        <w:rPr/>
-        <w:t>fast-moving businesses. Currently manage a 4,000+ SKU e-commerce catalog at Climb On Equipment, building an AI-powered product upload pipeline and new inventory-system data flow automations (Prediko ⇌ Shopify); previously drove 100% e-commerce growth in two years at RMU Outdoors while maintaining oversight of $1.8M in inventory across global distribution channels, and built operational pipelines for inventory management and reporting automation.</w:t>
+        <w:rPr/>
+      </w:pPr>
+      <w:r>
+        <w:rPr/>
+        <w:t>6+ years of operations and data-focused experience, including automation pipelines, statistical analysis, and applied modeling in entrepreneurial and fast-moving businesses. Currently manage a 4,000+ SKU e-commerce catalog at Climb On Equipment, building an AI-powered product upload pipeline and new inventory-system data flow automations (Prediko ⇌ Shopify); previously drove 100% e-commerce growth in two years at RMU Outdoors while maintaining oversight of $1.8M in inventory across global distribution channels, and built operational pipelines for inventory management and reporting automation.</w:t>
       </w:r>
     </w:p>
     <w:p>

</xml_diff>